<commit_message>
docs: add figure reference to manuscript and regenerate docx
</commit_message>
<xml_diff>
--- a/neurotk_jors.docx
+++ b/neurotk_jors.docx
@@ -351,7 +351,7 @@
       </w:r>
     </w:p>
     <w:bookmarkEnd w:id="11"/>
-    <w:bookmarkStart w:id="12" w:name="software-design"/>
+    <w:bookmarkStart w:id="15" w:name="software-design"/>
     <w:p>
       <w:pPr>
         <w:pStyle w:val="Heading1"/>
@@ -655,6 +655,81 @@
         <w:pStyle w:val="FirstParagraph"/>
       </w:pPr>
       <w:r>
+        <w:t xml:space="preserve">Figure 1 illustrates the end-to-end architecture and processing pipeline,</w:t>
+      </w:r>
+      <w:r>
+        <w:t xml:space="preserve"> </w:t>
+      </w:r>
+      <w:r>
+        <w:t xml:space="preserve">showing how each interaction mode feeds into the validation, optional</w:t>
+      </w:r>
+      <w:r>
+        <w:t xml:space="preserve"> </w:t>
+      </w:r>
+      <w:r>
+        <w:t xml:space="preserve">standardization, optional inference, and evaluation stages.</w:t>
+      </w:r>
+    </w:p>
+    <w:p>
+      <w:pPr>
+        <w:pStyle w:val="CaptionedFigure"/>
+      </w:pPr>
+      <w:r>
+        <w:drawing>
+          <wp:inline>
+            <wp:extent cx="5334000" cy="8609071"/>
+            <wp:effectExtent b="0" l="0" r="0" t="0"/>
+            <wp:docPr descr="NeuroTK architecture and processing pipeline." title="" id="13" name="Picture"/>
+            <a:graphic>
+              <a:graphicData uri="http://schemas.openxmlformats.org/drawingml/2006/picture">
+                <pic:pic>
+                  <pic:nvPicPr>
+                    <pic:cNvPr descr="neurotk_architecture.png" id="14" name="Picture"/>
+                    <pic:cNvPicPr>
+                      <a:picLocks noChangeArrowheads="1" noChangeAspect="1"/>
+                    </pic:cNvPicPr>
+                  </pic:nvPicPr>
+                  <pic:blipFill>
+                    <a:blip r:embed="rId12"/>
+                    <a:stretch>
+                      <a:fillRect/>
+                    </a:stretch>
+                  </pic:blipFill>
+                  <pic:spPr bwMode="auto">
+                    <a:xfrm>
+                      <a:off x="0" y="0"/>
+                      <a:ext cx="5334000" cy="8609071"/>
+                    </a:xfrm>
+                    <a:prstGeom prst="rect">
+                      <a:avLst/>
+                    </a:prstGeom>
+                    <a:noFill/>
+                    <a:ln w="9525">
+                      <a:noFill/>
+                      <a:headEnd/>
+                      <a:tailEnd/>
+                    </a:ln>
+                  </pic:spPr>
+                </pic:pic>
+              </a:graphicData>
+            </a:graphic>
+          </wp:inline>
+        </w:drawing>
+      </w:r>
+    </w:p>
+    <w:p>
+      <w:pPr>
+        <w:pStyle w:val="ImageCaption"/>
+      </w:pPr>
+      <w:r>
+        <w:t xml:space="preserve">NeuroTK architecture and processing pipeline.</w:t>
+      </w:r>
+    </w:p>
+    <w:p>
+      <w:pPr>
+        <w:pStyle w:val="BodyText"/>
+      </w:pPr>
+      <w:r>
         <w:t xml:space="preserve">A Dockerfile is provided for containerized deployment. Installation requires</w:t>
       </w:r>
       <w:r>
@@ -688,8 +763,8 @@
         <w:t xml:space="preserve">.</w:t>
       </w:r>
     </w:p>
-    <w:bookmarkEnd w:id="12"/>
-    <w:bookmarkStart w:id="13" w:name="quality-control"/>
+    <w:bookmarkEnd w:id="15"/>
+    <w:bookmarkStart w:id="16" w:name="quality-control"/>
     <w:p>
       <w:pPr>
         <w:pStyle w:val="Heading1"/>
@@ -957,8 +1032,8 @@
         <w:t xml:space="preserve">.</w:t>
       </w:r>
     </w:p>
-    <w:bookmarkEnd w:id="13"/>
-    <w:bookmarkStart w:id="14" w:name="availability"/>
+    <w:bookmarkEnd w:id="16"/>
+    <w:bookmarkStart w:id="17" w:name="availability"/>
     <w:p>
       <w:pPr>
         <w:pStyle w:val="Heading1"/>
@@ -1058,8 +1133,8 @@
         <w:t xml:space="preserve">(PyPI)</w:t>
       </w:r>
     </w:p>
-    <w:bookmarkEnd w:id="14"/>
-    <w:bookmarkStart w:id="20" w:name="reuse"/>
+    <w:bookmarkEnd w:id="17"/>
+    <w:bookmarkStart w:id="23" w:name="reuse"/>
     <w:p>
       <w:pPr>
         <w:pStyle w:val="Heading1"/>
@@ -1115,7 +1190,7 @@
         <w:t xml:space="preserve">macOS, and Windows without GPU for validation and preprocessing tasks.</w:t>
       </w:r>
     </w:p>
-    <w:bookmarkStart w:id="15" w:name="concrete-reuse-scenarios"/>
+    <w:bookmarkStart w:id="18" w:name="concrete-reuse-scenarios"/>
     <w:p>
       <w:pPr>
         <w:pStyle w:val="Heading2"/>
@@ -1316,8 +1391,8 @@
         <w:t xml:space="preserve">evaluation.</w:t>
       </w:r>
     </w:p>
-    <w:bookmarkEnd w:id="15"/>
-    <w:bookmarkStart w:id="16" w:name="python-api-usage"/>
+    <w:bookmarkEnd w:id="18"/>
+    <w:bookmarkStart w:id="19" w:name="python-api-usage"/>
     <w:p>
       <w:pPr>
         <w:pStyle w:val="Heading2"/>
@@ -1690,8 +1765,8 @@
         <w:t xml:space="preserve">)</w:t>
       </w:r>
     </w:p>
-    <w:bookmarkEnd w:id="16"/>
-    <w:bookmarkStart w:id="17" w:name="continuous-integration-example"/>
+    <w:bookmarkEnd w:id="19"/>
+    <w:bookmarkStart w:id="20" w:name="continuous-integration-example"/>
     <w:p>
       <w:pPr>
         <w:pStyle w:val="Heading2"/>
@@ -1842,8 +1917,8 @@
         <w:t xml:space="preserve">    "</w:t>
       </w:r>
     </w:p>
-    <w:bookmarkEnd w:id="17"/>
-    <w:bookmarkStart w:id="18" w:name="batch-processing"/>
+    <w:bookmarkEnd w:id="20"/>
+    <w:bookmarkStart w:id="21" w:name="batch-processing"/>
     <w:p>
       <w:pPr>
         <w:pStyle w:val="Heading2"/>
@@ -2048,8 +2123,8 @@
         <w:t xml:space="preserve"> hist.png</w:t>
       </w:r>
     </w:p>
-    <w:bookmarkEnd w:id="18"/>
-    <w:bookmarkStart w:id="19" w:name="extension"/>
+    <w:bookmarkEnd w:id="21"/>
+    <w:bookmarkStart w:id="22" w:name="extension"/>
     <w:p>
       <w:pPr>
         <w:pStyle w:val="Heading2"/>
@@ -2090,9 +2165,9 @@
         <w:t xml:space="preserve">reports across studies.</w:t>
       </w:r>
     </w:p>
-    <w:bookmarkEnd w:id="19"/>
-    <w:bookmarkEnd w:id="20"/>
-    <w:bookmarkStart w:id="21" w:name="support"/>
+    <w:bookmarkEnd w:id="22"/>
+    <w:bookmarkEnd w:id="23"/>
+    <w:bookmarkStart w:id="24" w:name="support"/>
     <w:p>
       <w:pPr>
         <w:pStyle w:val="Heading1"/>
@@ -2205,8 +2280,8 @@
         <w:t xml:space="preserve">week.</w:t>
       </w:r>
     </w:p>
-    <w:bookmarkEnd w:id="21"/>
-    <w:bookmarkStart w:id="22" w:name="research-impact-statement"/>
+    <w:bookmarkEnd w:id="24"/>
+    <w:bookmarkStart w:id="25" w:name="research-impact-statement"/>
     <w:p>
       <w:pPr>
         <w:pStyle w:val="Heading1"/>
@@ -2291,8 +2366,8 @@
         <w:t xml:space="preserve">adoption in reproducible neuroimaging research and educational settings.</w:t>
       </w:r>
     </w:p>
-    <w:bookmarkEnd w:id="22"/>
-    <w:bookmarkStart w:id="23" w:name="ai-usage-disclosure"/>
+    <w:bookmarkEnd w:id="25"/>
+    <w:bookmarkStart w:id="26" w:name="ai-usage-disclosure"/>
     <w:p>
       <w:pPr>
         <w:pStyle w:val="Heading1"/>
@@ -2351,8 +2426,8 @@
         <w:t xml:space="preserve">responsibility for the correctness and integrity of the software and manuscript.</w:t>
       </w:r>
     </w:p>
-    <w:bookmarkEnd w:id="23"/>
-    <w:bookmarkStart w:id="24" w:name="acknowledgements"/>
+    <w:bookmarkEnd w:id="26"/>
+    <w:bookmarkStart w:id="27" w:name="acknowledgements"/>
     <w:p>
       <w:pPr>
         <w:pStyle w:val="Heading1"/>
@@ -2381,8 +2456,8 @@
         <w:t xml:space="preserve">software.</w:t>
       </w:r>
     </w:p>
-    <w:bookmarkEnd w:id="24"/>
-    <w:bookmarkStart w:id="39" w:name="references"/>
+    <w:bookmarkEnd w:id="27"/>
+    <w:bookmarkStart w:id="42" w:name="references"/>
     <w:p>
       <w:pPr>
         <w:pStyle w:val="Heading1"/>
@@ -2391,8 +2466,8 @@
         <w:t xml:space="preserve">References</w:t>
       </w:r>
     </w:p>
-    <w:bookmarkStart w:id="38" w:name="refs"/>
-    <w:bookmarkStart w:id="26" w:name="ref-nibabel"/>
+    <w:bookmarkStart w:id="41" w:name="refs"/>
+    <w:bookmarkStart w:id="29" w:name="ref-nibabel"/>
     <w:p>
       <w:pPr>
         <w:pStyle w:val="Bibliography"/>
@@ -2425,7 +2500,7 @@
       <w:r>
         <w:t xml:space="preserve"> </w:t>
       </w:r>
-      <w:hyperlink r:id="rId25">
+      <w:hyperlink r:id="rId28">
         <w:r>
           <w:rPr>
             <w:rStyle w:val="Hyperlink"/>
@@ -2437,8 +2512,8 @@
         <w:t xml:space="preserve">.</w:t>
       </w:r>
     </w:p>
-    <w:bookmarkEnd w:id="26"/>
-    <w:bookmarkStart w:id="28" w:name="ref-nifti"/>
+    <w:bookmarkEnd w:id="29"/>
+    <w:bookmarkStart w:id="31" w:name="ref-nifti"/>
     <w:p>
       <w:pPr>
         <w:pStyle w:val="Bibliography"/>
@@ -2486,7 +2561,7 @@
       <w:r>
         <w:t xml:space="preserve"> </w:t>
       </w:r>
-      <w:hyperlink r:id="rId27">
+      <w:hyperlink r:id="rId30">
         <w:r>
           <w:rPr>
             <w:rStyle w:val="Hyperlink"/>
@@ -2498,8 +2573,8 @@
         <w:t xml:space="preserve">.</w:t>
       </w:r>
     </w:p>
-    <w:bookmarkEnd w:id="28"/>
-    <w:bookmarkStart w:id="30" w:name="ref-isensee2021nnu"/>
+    <w:bookmarkEnd w:id="31"/>
+    <w:bookmarkStart w:id="33" w:name="ref-isensee2021nnu"/>
     <w:p>
       <w:pPr>
         <w:pStyle w:val="Bibliography"/>
@@ -2532,7 +2607,7 @@
       <w:r>
         <w:t xml:space="preserve"> </w:t>
       </w:r>
-      <w:hyperlink r:id="rId29">
+      <w:hyperlink r:id="rId32">
         <w:r>
           <w:rPr>
             <w:rStyle w:val="Hyperlink"/>
@@ -2544,8 +2619,8 @@
         <w:t xml:space="preserve">.</w:t>
       </w:r>
     </w:p>
-    <w:bookmarkEnd w:id="30"/>
-    <w:bookmarkStart w:id="32" w:name="ref-simpleitk"/>
+    <w:bookmarkEnd w:id="33"/>
+    <w:bookmarkStart w:id="35" w:name="ref-simpleitk"/>
     <w:p>
       <w:pPr>
         <w:pStyle w:val="Bibliography"/>
@@ -2578,7 +2653,7 @@
       <w:r>
         <w:t xml:space="preserve"> </w:t>
       </w:r>
-      <w:hyperlink r:id="rId31">
+      <w:hyperlink r:id="rId34">
         <w:r>
           <w:rPr>
             <w:rStyle w:val="Hyperlink"/>
@@ -2590,8 +2665,8 @@
         <w:t xml:space="preserve">.</w:t>
       </w:r>
     </w:p>
-    <w:bookmarkEnd w:id="32"/>
-    <w:bookmarkStart w:id="34" w:name="ref-monai"/>
+    <w:bookmarkEnd w:id="35"/>
+    <w:bookmarkStart w:id="37" w:name="ref-monai"/>
     <w:p>
       <w:pPr>
         <w:pStyle w:val="Bibliography"/>
@@ -2627,7 +2702,7 @@
       <w:r>
         <w:t xml:space="preserve"> </w:t>
       </w:r>
-      <w:hyperlink r:id="rId33">
+      <w:hyperlink r:id="rId36">
         <w:r>
           <w:rPr>
             <w:rStyle w:val="Hyperlink"/>
@@ -2639,8 +2714,8 @@
         <w:t xml:space="preserve">.</w:t>
       </w:r>
     </w:p>
-    <w:bookmarkEnd w:id="34"/>
-    <w:bookmarkStart w:id="36" w:name="ref-monteiro2020"/>
+    <w:bookmarkEnd w:id="37"/>
+    <w:bookmarkStart w:id="39" w:name="ref-monteiro2020"/>
     <w:p>
       <w:pPr>
         <w:pStyle w:val="Bibliography"/>
@@ -2688,7 +2763,7 @@
       <w:r>
         <w:t xml:space="preserve"> </w:t>
       </w:r>
-      <w:hyperlink r:id="rId35">
+      <w:hyperlink r:id="rId38">
         <w:r>
           <w:rPr>
             <w:rStyle w:val="Hyperlink"/>
@@ -2700,8 +2775,8 @@
         <w:t xml:space="preserve">.</w:t>
       </w:r>
     </w:p>
-    <w:bookmarkEnd w:id="36"/>
-    <w:bookmarkStart w:id="37" w:name="ref-rathi2026tbi"/>
+    <w:bookmarkEnd w:id="39"/>
+    <w:bookmarkStart w:id="40" w:name="ref-rathi2026tbi"/>
     <w:p>
       <w:pPr>
         <w:pStyle w:val="Bibliography"/>
@@ -2738,9 +2813,9 @@
         <w:t xml:space="preserve">.</w:t>
       </w:r>
     </w:p>
-    <w:bookmarkEnd w:id="37"/>
-    <w:bookmarkEnd w:id="38"/>
-    <w:bookmarkEnd w:id="39"/>
+    <w:bookmarkEnd w:id="40"/>
+    <w:bookmarkEnd w:id="41"/>
+    <w:bookmarkEnd w:id="42"/>
     <w:sectPr>
       <w:footnotePr>
         <w:numRestart w:val="eachSect"/>

</xml_diff>

<commit_message>
docs: replace figure with final mermaid architecture diagram and regenerate docx
</commit_message>
<xml_diff>
--- a/neurotk_jors.docx
+++ b/neurotk_jors.docx
@@ -677,7 +677,7 @@
       <w:r>
         <w:drawing>
           <wp:inline>
-            <wp:extent cx="5334000" cy="8609071"/>
+            <wp:extent cx="5334000" cy="338583"/>
             <wp:effectExtent b="0" l="0" r="0" t="0"/>
             <wp:docPr descr="NeuroTK architecture and processing pipeline." title="" id="13" name="Picture"/>
             <a:graphic>
@@ -698,7 +698,7 @@
                   <pic:spPr bwMode="auto">
                     <a:xfrm>
                       <a:off x="0" y="0"/>
-                      <a:ext cx="5334000" cy="8609071"/>
+                      <a:ext cx="5334000" cy="338583"/>
                     </a:xfrm>
                     <a:prstGeom prst="rect">
                       <a:avLst/>

</xml_diff>